<commit_message>
docs: replace outdated competition overviews
</commit_message>
<xml_diff>
--- a/docs/DSC2026_Task2_LegalQA_Data_Overview.docx
+++ b/docs/DSC2026_Task2_LegalQA_Data_Overview.docx
@@ -74,7 +74,7 @@
     <w:tbl>
       <w:tblPr>
         <w:tblStyle w:val="Table1"/>
-        <w:tblW w:w="10368.0" w:type="dxa"/>
+        <w:tblW w:w="10380.0" w:type="dxa"/>
         <w:jc w:val="center"/>
         <w:tblBorders>
           <w:top w:color="d5dce5" w:space="0" w:sz="6" w:val="single"/>
@@ -88,12 +88,12 @@
         <w:tblLook w:val="0400"/>
       </w:tblPr>
       <w:tblGrid>
-        <w:gridCol w:w="5184"/>
-        <w:gridCol w:w="5184"/>
+        <w:gridCol w:w="2235"/>
+        <w:gridCol w:w="8145"/>
         <w:tblGridChange w:id="0">
           <w:tblGrid>
-            <w:gridCol w:w="5184"/>
-            <w:gridCol w:w="5184"/>
+            <w:gridCol w:w="2235"/>
+            <w:gridCol w:w="8145"/>
           </w:tblGrid>
         </w:tblGridChange>
       </w:tblGrid>
@@ -153,71 +153,6 @@
                 <w:rtl w:val="0"/>
               </w:rPr>
               <w:t xml:space="preserve">Với một câu hỏi pháp luật, hệ thống truy xuất văn bản liên quan và tạo câu trả lời bằng văn xuôi dựa trên căn cứ pháp lý.</w:t>
-            </w:r>
-            <w:r>
-              <w:rPr>
-                <w:rtl w:val="0"/>
-              </w:rPr>
-            </w:r>
-          </w:p>
-        </w:tc>
-      </w:tr>
-      <w:tr>
-        <w:trPr>
-          <w:cantSplit w:val="0"/>
-          <w:tblHeader w:val="0"/>
-        </w:trPr>
-        <w:tc>
-          <w:tcPr>
-            <w:shd w:fill="2f75b5" w:val="clear"/>
-            <w:vAlign w:val="center"/>
-          </w:tcPr>
-          <w:p>
-            <w:pPr>
-              <w:spacing w:after="0" w:lineRule="auto"/>
-              <w:rPr>
-                <w:rFonts w:ascii="Times New Roman" w:cs="Times New Roman" w:eastAsia="Times New Roman" w:hAnsi="Times New Roman"/>
-              </w:rPr>
-            </w:pPr>
-            <w:r>
-              <w:rPr>
-                <w:rFonts w:ascii="Times New Roman" w:cs="Times New Roman" w:eastAsia="Times New Roman" w:hAnsi="Times New Roman"/>
-                <w:b w:val="1"/>
-                <w:bCs w:val="1"/>
-                <w:color w:val="ffffff"/>
-                <w:sz w:val="19"/>
-                <w:szCs w:val="19"/>
-                <w:rtl w:val="0"/>
-              </w:rPr>
-              <w:t xml:space="preserve">Quy mô dữ liệu</w:t>
-            </w:r>
-            <w:r>
-              <w:rPr>
-                <w:rtl w:val="0"/>
-              </w:rPr>
-            </w:r>
-          </w:p>
-        </w:tc>
-        <w:tc>
-          <w:tcPr>
-            <w:shd w:fill="ffffff" w:val="clear"/>
-            <w:vAlign w:val="center"/>
-          </w:tcPr>
-          <w:p>
-            <w:pPr>
-              <w:spacing w:after="0" w:lineRule="auto"/>
-              <w:rPr>
-                <w:rFonts w:ascii="Times New Roman" w:cs="Times New Roman" w:eastAsia="Times New Roman" w:hAnsi="Times New Roman"/>
-              </w:rPr>
-            </w:pPr>
-            <w:r>
-              <w:rPr>
-                <w:rFonts w:ascii="Times New Roman" w:cs="Times New Roman" w:eastAsia="Times New Roman" w:hAnsi="Times New Roman"/>
-                <w:sz w:val="19"/>
-                <w:szCs w:val="19"/>
-                <w:rtl w:val="0"/>
-              </w:rPr>
-              <w:t xml:space="preserve">Khoảng 8.500 văn bản hành chính + 10.000 câu hỏi.</w:t>
             </w:r>
             <w:r>
               <w:rPr>
@@ -599,7 +534,7 @@
           <w:rFonts w:ascii="Times New Roman" w:cs="Times New Roman" w:eastAsia="Times New Roman" w:hAnsi="Times New Roman"/>
           <w:rtl w:val="0"/>
         </w:rPr>
-        <w:t xml:space="preserve">2. Cấu trúc dữ liệu cung cấp</w:t>
+        <w:t xml:space="preserve">2. Cấu trúc dữ liệu (Sẽ được cung cấp tương ứng theo timeline cuộc thi)</w:t>
       </w:r>
     </w:p>
     <w:tbl>

</xml_diff>